<commit_message>
User guide (EN): compact layout (two charts per row, chart beside its text, tables in two columns)
Margins 0.3in left/right, half-width charts paired within a step, lone chart beside its explanation,
consecutive small tables arranged in two columns, wide charts at full text width. 106 -> 81 pages.

Co-Authored-By: Claude Sonnet 5.5 <noreply@anthropic.com>
Claude-Session: https://claude.ai/code/session_019dELNUNjVMr3Ja2mUwBrCu
</commit_message>
<xml_diff>
--- a/docs/user-guide/en/pages/00-cover-contents.docx
+++ b/docs/user-guide/en/pages/00-cover-contents.docx
@@ -141,7 +141,7 @@
       <w:pPr>
         <w:sectPr>
           <w:pgSz w:w="11906" w:h="16838" w:orient="portrait"/>
-          <w:pgMar w:top="1300" w:right="1250" w:bottom="1000" w:left="1250" w:header="708" w:footer="708" w:gutter="0"/>
+          <w:pgMar w:top="1500" w:right="432" w:bottom="994" w:left="432" w:header="706" w:footer="706" w:gutter="0"/>
           <w:pgNumType/>
           <w:docGrid w:linePitch="360"/>
         </w:sectPr>
@@ -190,7 +190,7 @@
       <w:footerReference w:type="default" r:id="rId8"/>
       <w:type w:val="nextPage"/>
       <w:pgSz w:w="11906" w:h="16838" w:orient="portrait"/>
-      <w:pgMar w:top="1300" w:right="1250" w:bottom="1000" w:left="1250" w:header="708" w:footer="708" w:gutter="0"/>
+      <w:pgMar w:top="1500" w:right="432" w:bottom="994" w:left="432" w:header="706" w:footer="706" w:gutter="0"/>
       <w:pgNumType/>
       <w:docGrid w:linePitch="360"/>
     </w:sectPr>

</xml_diff>

<commit_message>
User guide (EN): wider contents spacing, Hiring Forecast table full width, Crew Trainers insights full width, Turnover chart moved up (67 pages)
Adds tools/resize_image.py, inspect_images.py and patch_toc_style.py for adjusting a finished page without regenerating it.

Co-Authored-By: Claude Sonnet 5.5 <noreply@anthropic.com>
Claude-Session: https://claude.ai/code/session_019dELNUNjVMr3Ja2mUwBrCu
</commit_message>
<xml_diff>
--- a/docs/user-guide/en/pages/00-cover-contents.docx
+++ b/docs/user-guide/en/pages/00-cover-contents.docx
@@ -1135,6 +1135,22 @@
       <w:szCs w:val="20"/>
     </w:rPr>
   </w:style>
+  <w:style w:type="paragraph" w:styleId="TOC1">
+    <w:name w:val="toc 1"/>
+    <w:basedOn w:val="Normal"/>
+    <w:next w:val="Normal"/>
+    <w:uiPriority w:val="39"/>
+    <w:unhideWhenUsed/>
+    <w:pPr>
+      <w:tabs>
+        <w:tab w:val="right" w:leader="dot" w:pos="11000"/>
+      </w:tabs>
+      <w:spacing w:before="0" w:after="220" w:line="360" w:lineRule="auto"/>
+    </w:pPr>
+    <w:rPr>
+      <w:sz w:val="26"/>
+    </w:rPr>
+  </w:style>
 </w:styles>
 </file>
 

</xml_diff>

<commit_message>
User guide (EN): add 'Human Resources' under McDonald's Egypt on the cover
Co-Authored-By: Claude Sonnet 5.5 <noreply@anthropic.com>
Claude-Session: https://claude.ai/code/session_019dELNUNjVMr3Ja2mUwBrCu
</commit_message>
<xml_diff>
--- a/docs/user-guide/en/pages/00-cover-contents.docx
+++ b/docs/user-guide/en/pages/00-cover-contents.docx
@@ -59,7 +59,7 @@
     </w:p>
     <w:p>
       <w:pPr>
-        <w:spacing w:after="200"/>
+        <w:spacing w:after="40"/>
         <w:jc w:val="center"/>
       </w:pPr>
       <w:r>
@@ -71,6 +71,20 @@
           <w:szCs w:val="32"/>
         </w:rPr>
         <w:t>McDonald's Egypt</w:t>
+      </w:r>
+    </w:p>
+    <w:p>
+      <w:pPr>
+        <w:spacing w:after="200"/>
+        <w:jc w:val="center"/>
+      </w:pPr>
+      <w:r>
+        <w:rPr>
+          <w:color w:val="666666"/>
+          <w:sz w:val="26"/>
+          <w:szCs w:val="26"/>
+        </w:rPr>
+        <w:t>Human Resources</w:t>
       </w:r>
     </w:p>
     <w:p>

</xml_diff>

<commit_message>
User guide (EN): add 'Human Resources' under McDonald's Egypt on the cover (#85)
Claude-Session: https://claude.ai/code/session_019dELNUNjVMr3Ja2mUwBrCu

Co-authored-by: Claude <noreply@anthropic.com>
</commit_message>
<xml_diff>
--- a/docs/user-guide/en/pages/00-cover-contents.docx
+++ b/docs/user-guide/en/pages/00-cover-contents.docx
@@ -59,7 +59,7 @@
     </w:p>
     <w:p>
       <w:pPr>
-        <w:spacing w:after="200"/>
+        <w:spacing w:after="40"/>
         <w:jc w:val="center"/>
       </w:pPr>
       <w:r>
@@ -71,6 +71,20 @@
           <w:szCs w:val="32"/>
         </w:rPr>
         <w:t>McDonald's Egypt</w:t>
+      </w:r>
+    </w:p>
+    <w:p>
+      <w:pPr>
+        <w:spacing w:after="200"/>
+        <w:jc w:val="center"/>
+      </w:pPr>
+      <w:r>
+        <w:rPr>
+          <w:color w:val="666666"/>
+          <w:sz w:val="26"/>
+          <w:szCs w:val="26"/>
+        </w:rPr>
+        <w:t>Human Resources</w:t>
       </w:r>
     </w:p>
     <w:p>

</xml_diff>